<commit_message>
Atualiza template do Contrato de Gestão: adiciona assinatura do CONTRATANTE
Antes o bloco de assinaturas pulava direto da data pra CONTRATADA/CORRETOR/
TESTEMUNHAS, sem nenhuma linha de assinatura do(s) CONTRATANTE(S). Agora tem
uma linha de assinatura pro contratante principal ({{NomeRazaoSocial}}/
{{CpfCnpj}}, mesmos campos já usados na qualificação no topo do contrato),
seguida de {{AssinaturasAdicionais}} pros demais proprietários do imóvel,
quando houver.

Testado renderizando o template com docxtemplater usando dados de exemplo —
sem tags sem resolver, bloco de assinatura aparece corretamente pro
contratante principal e para um proprietário adicional.
</commit_message>
<xml_diff>
--- a/templates/contrato_gestao.docx
+++ b/templates/contrato_gestao.docx
@@ -3408,6 +3408,42 @@
           <w:sz w:val="24"/>
           <w:szCs w:val="24"/>
         </w:rPr>
+        <w:t>_________________________________</w:t>
+      </w:r>
+    </w:p>
+    <w:p>
+      <w:pPr>
+        <w:spacing w:line="360" w:lineRule="auto"/>
+        <w:ind w:left="-566" w:right="-607"/>
+        <w:jc w:val="center"/>
+        <w:rPr>
+          <w:sz w:val="24"/>
+          <w:szCs w:val="24"/>
+        </w:rPr>
+      </w:pPr>
+      <w:r>
+        <w:rPr>
+          <w:sz w:val="24"/>
+          <w:szCs w:val="24"/>
+        </w:rPr>
+        <w:t>CONTRATANTE</w:t>
+      </w:r>
+    </w:p>
+    <w:p>
+      <w:pPr>
+        <w:spacing w:line="360" w:lineRule="auto"/>
+        <w:ind w:left="-566" w:right="-607"/>
+        <w:jc w:val="center"/>
+        <w:rPr>
+          <w:sz w:val="24"/>
+          <w:szCs w:val="24"/>
+        </w:rPr>
+      </w:pPr>
+      <w:r>
+        <w:rPr>
+          <w:sz w:val="24"/>
+          <w:szCs w:val="24"/>
+        </w:rPr>
         <w:t>{{</w:t>
       </w:r>
       <w:proofErr w:type="spellStart"/>
@@ -3416,6 +3452,86 @@
           <w:sz w:val="24"/>
           <w:szCs w:val="24"/>
         </w:rPr>
+        <w:t>NomeRazaoSocial</w:t>
+      </w:r>
+      <w:proofErr w:type="spellEnd"/>
+      <w:r>
+        <w:rPr>
+          <w:sz w:val="24"/>
+          <w:szCs w:val="24"/>
+        </w:rPr>
+        <w:t>}}</w:t>
+      </w:r>
+      <w:r>
+        <w:rPr>
+          <w:sz w:val="24"/>
+          <w:szCs w:val="24"/>
+        </w:rPr>
+        <w:br/>
+        <w:t>{{</w:t>
+      </w:r>
+      <w:proofErr w:type="spellStart"/>
+      <w:r>
+        <w:rPr>
+          <w:sz w:val="24"/>
+          <w:szCs w:val="24"/>
+        </w:rPr>
+        <w:t>CpfCnpj</w:t>
+      </w:r>
+      <w:proofErr w:type="spellEnd"/>
+      <w:r>
+        <w:rPr>
+          <w:sz w:val="24"/>
+          <w:szCs w:val="24"/>
+        </w:rPr>
+        <w:t>}}</w:t>
+      </w:r>
+    </w:p>
+    <w:p>
+      <w:pPr>
+        <w:spacing w:line="360" w:lineRule="auto"/>
+        <w:ind w:left="-566" w:right="-607"/>
+        <w:jc w:val="center"/>
+        <w:rPr>
+          <w:sz w:val="24"/>
+          <w:szCs w:val="24"/>
+        </w:rPr>
+      </w:pPr>
+    </w:p>
+    <w:p>
+      <w:pPr>
+        <w:spacing w:line="360" w:lineRule="auto"/>
+        <w:ind w:left="-566" w:right="-607"/>
+        <w:jc w:val="right"/>
+        <w:rPr>
+          <w:sz w:val="24"/>
+          <w:szCs w:val="24"/>
+        </w:rPr>
+      </w:pPr>
+    </w:p>
+    <w:p>
+      <w:pPr>
+        <w:spacing w:line="360" w:lineRule="auto"/>
+        <w:ind w:left="-566" w:right="-607"/>
+        <w:jc w:val="center"/>
+        <w:rPr>
+          <w:sz w:val="24"/>
+          <w:szCs w:val="24"/>
+        </w:rPr>
+      </w:pPr>
+      <w:r>
+        <w:rPr>
+          <w:sz w:val="24"/>
+          <w:szCs w:val="24"/>
+        </w:rPr>
+        <w:t>{{</w:t>
+      </w:r>
+      <w:proofErr w:type="spellStart"/>
+      <w:r>
+        <w:rPr>
+          <w:sz w:val="24"/>
+          <w:szCs w:val="24"/>
+        </w:rPr>
         <w:t>AssinaturasAdicionais</w:t>
       </w:r>
       <w:proofErr w:type="spellEnd"/>
@@ -3437,113 +3553,81 @@
           <w:szCs w:val="24"/>
         </w:rPr>
       </w:pPr>
-    </w:p>
-    <w:p>
-      <w:pPr>
-        <w:spacing w:line="360" w:lineRule="auto"/>
-        <w:ind w:left="-566" w:right="-607"/>
-        <w:jc w:val="center"/>
-        <w:rPr>
-          <w:sz w:val="24"/>
-          <w:szCs w:val="24"/>
-        </w:rPr>
-      </w:pPr>
-    </w:p>
-    <w:p>
-      <w:pPr>
-        <w:spacing w:line="360" w:lineRule="auto"/>
-        <w:ind w:left="-566" w:right="-607"/>
-        <w:jc w:val="center"/>
-        <w:rPr>
-          <w:sz w:val="24"/>
-          <w:szCs w:val="24"/>
-        </w:rPr>
-      </w:pPr>
-    </w:p>
-    <w:p>
-      <w:pPr>
-        <w:spacing w:line="360" w:lineRule="auto"/>
-        <w:ind w:left="-566" w:right="-607"/>
-        <w:jc w:val="center"/>
-        <w:rPr>
-          <w:sz w:val="24"/>
-          <w:szCs w:val="24"/>
-        </w:rPr>
-      </w:pPr>
-    </w:p>
-    <w:p>
-      <w:pPr>
-        <w:spacing w:line="360" w:lineRule="auto"/>
-        <w:ind w:left="-566" w:right="-607"/>
-        <w:jc w:val="center"/>
-        <w:rPr>
-          <w:sz w:val="24"/>
-          <w:szCs w:val="24"/>
-        </w:rPr>
-      </w:pPr>
-    </w:p>
-    <w:p>
-      <w:pPr>
-        <w:spacing w:line="360" w:lineRule="auto"/>
-        <w:ind w:left="-566" w:right="-607"/>
-        <w:jc w:val="center"/>
-        <w:rPr>
-          <w:sz w:val="24"/>
-          <w:szCs w:val="24"/>
-        </w:rPr>
-      </w:pPr>
-      <w:r>
-        <w:rPr>
-          <w:sz w:val="24"/>
-          <w:szCs w:val="24"/>
-        </w:rPr>
-        <w:t>_________________________________</w:t>
-      </w:r>
-    </w:p>
-    <w:p>
-      <w:pPr>
-        <w:spacing w:line="360" w:lineRule="auto"/>
-        <w:ind w:left="-566" w:right="-607"/>
-        <w:jc w:val="center"/>
-        <w:rPr>
-          <w:sz w:val="24"/>
-          <w:szCs w:val="24"/>
-        </w:rPr>
-      </w:pPr>
-      <w:r>
-        <w:rPr>
-          <w:sz w:val="24"/>
-          <w:szCs w:val="24"/>
-        </w:rPr>
-        <w:t>CONTRATADA</w:t>
-      </w:r>
-    </w:p>
-    <w:p>
-      <w:pPr>
-        <w:spacing w:line="360" w:lineRule="auto"/>
-        <w:ind w:left="-566" w:right="-607"/>
-        <w:jc w:val="center"/>
-        <w:rPr>
-          <w:sz w:val="24"/>
-          <w:szCs w:val="24"/>
-        </w:rPr>
-      </w:pPr>
-      <w:r>
-        <w:rPr>
-          <w:sz w:val="24"/>
-          <w:szCs w:val="24"/>
-        </w:rPr>
-        <w:t xml:space="preserve">Imobiliária </w:t>
-      </w:r>
-      <w:r>
-        <w:rPr>
-          <w:sz w:val="24"/>
-          <w:szCs w:val="24"/>
-        </w:rPr>
-        <w:t>Remax</w:t>
-      </w:r>
       <w:bookmarkStart w:id="0" w:name="_GoBack"/>
       <w:bookmarkEnd w:id="0"/>
+    </w:p>
+    <w:p>
+      <w:pPr>
+        <w:spacing w:line="360" w:lineRule="auto"/>
+        <w:ind w:left="-566" w:right="-607"/>
+        <w:jc w:val="center"/>
+        <w:rPr>
+          <w:sz w:val="24"/>
+          <w:szCs w:val="24"/>
+        </w:rPr>
+      </w:pPr>
+    </w:p>
+    <w:p>
+      <w:pPr>
+        <w:spacing w:line="360" w:lineRule="auto"/>
+        <w:ind w:left="-566" w:right="-607"/>
+        <w:jc w:val="center"/>
+        <w:rPr>
+          <w:sz w:val="24"/>
+          <w:szCs w:val="24"/>
+        </w:rPr>
+      </w:pPr>
+      <w:r>
+        <w:rPr>
+          <w:sz w:val="24"/>
+          <w:szCs w:val="24"/>
+        </w:rPr>
+        <w:t>_________________________________</w:t>
+      </w:r>
+    </w:p>
+    <w:p>
+      <w:pPr>
+        <w:spacing w:line="360" w:lineRule="auto"/>
+        <w:ind w:left="-566" w:right="-607"/>
+        <w:jc w:val="center"/>
+        <w:rPr>
+          <w:sz w:val="24"/>
+          <w:szCs w:val="24"/>
+        </w:rPr>
+      </w:pPr>
+      <w:r>
+        <w:rPr>
+          <w:sz w:val="24"/>
+          <w:szCs w:val="24"/>
+        </w:rPr>
+        <w:t>CONTRATADA</w:t>
+      </w:r>
+    </w:p>
+    <w:p>
+      <w:pPr>
+        <w:spacing w:line="360" w:lineRule="auto"/>
+        <w:ind w:left="-566" w:right="-607"/>
+        <w:jc w:val="center"/>
+        <w:rPr>
+          <w:sz w:val="24"/>
+          <w:szCs w:val="24"/>
+        </w:rPr>
+      </w:pPr>
+      <w:r>
+        <w:rPr>
+          <w:sz w:val="24"/>
+          <w:szCs w:val="24"/>
+        </w:rPr>
+        <w:lastRenderedPageBreak/>
+        <w:t xml:space="preserve">Imobiliária </w:t>
+      </w:r>
+      <w:r>
+        <w:rPr>
+          <w:sz w:val="24"/>
+          <w:szCs w:val="24"/>
+        </w:rPr>
+        <w:t>Remax</w:t>
+      </w:r>
       <w:r>
         <w:rPr>
           <w:sz w:val="24"/>
@@ -3597,7 +3681,6 @@
           <w:sz w:val="24"/>
           <w:szCs w:val="24"/>
         </w:rPr>
-        <w:lastRenderedPageBreak/>
         <w:t>_________________________________</w:t>
       </w:r>
     </w:p>

</xml_diff>